<commit_message>
MacroFiscalModels: shared calibration of GIMF-lite and DIGNAD-lite from the dashboard
calibration.py sets the settings both models share (efficiency from PEFA PI-11,
return on public capital, public investment, taxes, debt and concessional share,
constrained households, borrowing cost) once, from the dashboard panel with
flagged income-group defaults; chooses the model by income group and reliance on
concessional finance; and cross-checks both on the public part of the NMIM
programme. Feasible for all 186 NMIM countries. The bridge now reports the share
of the programme that is non-CO2 / land-use spending, which the macro models
still treat as capital (TODO item 7). TODO gains options 2-3 and items on
efficiency and tariff revenue versus public return.

Co-Authored-By: Claude Opus 5.5 <noreply@anthropic.com>
Claude-Session: https://claude.ai/code/session_012ycgCvLtGNELqWAvcBTHbw
</commit_message>
<xml_diff>
--- a/MacroFiscalModels/Docs/UserGuide_0_GettingStarted.docx
+++ b/MacroFiscalModels/Docs/UserGuide_0_GettingStarted.docx
@@ -1104,7 +1104,177 @@
       </w:r>
     </w:p>
     <w:bookmarkEnd w:id="23"/>
-    <w:bookmarkStart w:id="24" w:name="how-the-pieces-connect"/>
+    <w:bookmarkStart w:id="24" w:name="calibrate-from-the-dashboard"/>
+    <w:p>
+      <w:pPr>
+        <w:pStyle w:val="Heading1"/>
+      </w:pPr>
+      <w:r>
+        <w:t xml:space="preserve">Calibrate from the dashboard</w:t>
+      </w:r>
+    </w:p>
+    <w:p>
+      <w:pPr>
+        <w:pStyle w:val="FirstParagraph"/>
+      </w:pPr>
+      <w:r>
+        <w:rPr>
+          <w:rStyle w:val="VerbatimChar"/>
+        </w:rPr>
+        <w:t xml:space="preserve">calibration.py</w:t>
+      </w:r>
+      <w:r>
+        <w:t xml:space="preserve"> </w:t>
+      </w:r>
+      <w:r>
+        <w:t xml:space="preserve">sets the settings both macro models share (efficiency, return on public capital, public investment, taxes, debt, concessional share, constrained households, borrowing cost) from the dashboard panel, with income-group defaults where data are missing. It also chooses the model and runs both on the public part of the programme as a cross-check:</w:t>
+      </w:r>
+    </w:p>
+    <w:p>
+      <w:pPr>
+        <w:pStyle w:val="SourceCode"/>
+      </w:pPr>
+      <w:r>
+        <w:rPr>
+          <w:rStyle w:val="VerbatimChar"/>
+        </w:rPr>
+        <w:t xml:space="preserve">python3 calibration.py KEN SLE UGA LBR</w:t>
+      </w:r>
+    </w:p>
+    <w:p>
+      <w:pPr>
+        <w:pStyle w:val="FirstParagraph"/>
+      </w:pPr>
+      <w:r>
+        <w:t xml:space="preserve">From code:</w:t>
+      </w:r>
+    </w:p>
+    <w:p>
+      <w:pPr>
+        <w:pStyle w:val="SourceCode"/>
+      </w:pPr>
+      <w:r>
+        <w:rPr>
+          <w:rStyle w:val="ImportTok"/>
+        </w:rPr>
+        <w:t xml:space="preserve">from</w:t>
+      </w:r>
+      <w:r>
+        <w:rPr>
+          <w:rStyle w:val="NormalTok"/>
+        </w:rPr>
+        <w:t xml:space="preserve"> calibration </w:t>
+      </w:r>
+      <w:r>
+        <w:rPr>
+          <w:rStyle w:val="ImportTok"/>
+        </w:rPr>
+        <w:t xml:space="preserve">import</w:t>
+      </w:r>
+      <w:r>
+        <w:rPr>
+          <w:rStyle w:val="NormalTok"/>
+        </w:rPr>
+        <w:t xml:space="preserve"> shared, to_gimf, to_dignad, choose_model</w:t>
+      </w:r>
+      <w:r>
+        <w:br/>
+      </w:r>
+      <w:r>
+        <w:rPr>
+          <w:rStyle w:val="NormalTok"/>
+        </w:rPr>
+        <w:t xml:space="preserve">sh </w:t>
+      </w:r>
+      <w:r>
+        <w:rPr>
+          <w:rStyle w:val="OperatorTok"/>
+        </w:rPr>
+        <w:t xml:space="preserve">=</w:t>
+      </w:r>
+      <w:r>
+        <w:rPr>
+          <w:rStyle w:val="NormalTok"/>
+        </w:rPr>
+        <w:t xml:space="preserve"> shared(</w:t>
+      </w:r>
+      <w:r>
+        <w:rPr>
+          <w:rStyle w:val="StringTok"/>
+        </w:rPr>
+        <w:t xml:space="preserve">"UGA"</w:t>
+      </w:r>
+      <w:r>
+        <w:rPr>
+          <w:rStyle w:val="NormalTok"/>
+        </w:rPr>
+        <w:t xml:space="preserve">)                  </w:t>
+      </w:r>
+      <w:r>
+        <w:rPr>
+          <w:rStyle w:val="CommentTok"/>
+        </w:rPr>
+        <w:t xml:space="preserve"># {setting: (value, source)}</w:t>
+      </w:r>
+      <w:r>
+        <w:br/>
+      </w:r>
+      <w:r>
+        <w:rPr>
+          <w:rStyle w:val="NormalTok"/>
+        </w:rPr>
+        <w:t xml:space="preserve">p_g, p_d </w:t>
+      </w:r>
+      <w:r>
+        <w:rPr>
+          <w:rStyle w:val="OperatorTok"/>
+        </w:rPr>
+        <w:t xml:space="preserve">=</w:t>
+      </w:r>
+      <w:r>
+        <w:rPr>
+          <w:rStyle w:val="NormalTok"/>
+        </w:rPr>
+        <w:t xml:space="preserve"> to_gimf(sh), to_dignad(sh)</w:t>
+      </w:r>
+      <w:r>
+        <w:br/>
+      </w:r>
+      <w:r>
+        <w:rPr>
+          <w:rStyle w:val="NormalTok"/>
+        </w:rPr>
+        <w:t xml:space="preserve">choose_model(</w:t>
+      </w:r>
+      <w:r>
+        <w:rPr>
+          <w:rStyle w:val="StringTok"/>
+        </w:rPr>
+        <w:t xml:space="preserve">"UGA"</w:t>
+      </w:r>
+      <w:r>
+        <w:rPr>
+          <w:rStyle w:val="NormalTok"/>
+        </w:rPr>
+        <w:t xml:space="preserve">)                 </w:t>
+      </w:r>
+      <w:r>
+        <w:rPr>
+          <w:rStyle w:val="CommentTok"/>
+        </w:rPr>
+        <w:t xml:space="preserve"># ('DIGNAD-lite', 'low-income country')</w:t>
+      </w:r>
+    </w:p>
+    <w:p>
+      <w:pPr>
+        <w:pStyle w:val="FirstParagraph"/>
+      </w:pPr>
+      <w:r>
+        <w:t xml:space="preserve">Check the warning it prints: where non-CO2 and land-use spending are a large share of the programme, the macro gains are overstated.</w:t>
+      </w:r>
+    </w:p>
+    <w:bookmarkEnd w:id="24"/>
+    <w:bookmarkStart w:id="25" w:name="how-the-pieces-connect"/>
     <w:p>
       <w:pPr>
         <w:pStyle w:val="Heading1"/>
@@ -1287,8 +1457,8 @@
         <w:t xml:space="preserve">rates it.</w:t>
       </w:r>
     </w:p>
-    <w:bookmarkEnd w:id="24"/>
-    <w:bookmarkStart w:id="25" w:name="where-to-read-more"/>
+    <w:bookmarkEnd w:id="25"/>
+    <w:bookmarkStart w:id="26" w:name="where-to-read-more"/>
     <w:p>
       <w:pPr>
         <w:pStyle w:val="Heading1"/>
@@ -1345,8 +1515,8 @@
         <w:t xml:space="preserve">: task log and caveats.</w:t>
       </w:r>
     </w:p>
-    <w:bookmarkEnd w:id="25"/>
-    <w:bookmarkStart w:id="26" w:name="five-rules-for-using-the-results"/>
+    <w:bookmarkEnd w:id="26"/>
+    <w:bookmarkStart w:id="27" w:name="five-rules-for-using-the-results"/>
     <w:p>
       <w:pPr>
         <w:pStyle w:val="Heading1"/>
@@ -1525,7 +1695,7 @@
         <w:t xml:space="preserve">It is the mechanics of the framework without judgement.</w:t>
       </w:r>
     </w:p>
-    <w:bookmarkEnd w:id="26"/>
+    <w:bookmarkEnd w:id="27"/>
     <w:sectPr>
       <w:pgSz w:h="15840" w:w="12240"/>
       <w:pgMar w:bottom="1296" w:footer="720" w:gutter="0" w:header="720" w:left="1296" w:right="1296" w:top="1296"/>

</xml_diff>